<commit_message>
Cập nhật bản Word phần 2.1, 2.2, 2.5.1
</commit_message>
<xml_diff>
--- a/SRS.docx
+++ b/SRS.docx
@@ -3608,9 +3608,38 @@
     </w:p>
     <w:p>
       <w:pPr>
+        <w:pStyle w:val="ListParagraph"/>
+        <w:numPr>
+          <w:ilvl w:val="0"/>
+          <w:numId w:val="40"/>
+        </w:numPr>
+        <w:ind w:left="720"/>
+        <w:rPr>
+          <w:sz w:val="24"/>
+        </w:rPr>
+      </w:pPr>
+      <w:r>
+        <w:t>Jira Software</w:t>
+      </w:r>
+    </w:p>
+    <w:p>
+      <w:pPr>
+        <w:pStyle w:val="ListParagraph"/>
+        <w:numPr>
+          <w:ilvl w:val="0"/>
+          <w:numId w:val="40"/>
+        </w:numPr>
+        <w:ind w:left="720"/>
+      </w:pPr>
+      <w:r>
+        <w:t>IEEE 830 / ISO/IEC/IEEE 29148 – Software Requirement Specification</w:t>
+      </w:r>
+      <w:bookmarkStart w:id="6" w:name="_Toc220996055"/>
+    </w:p>
+    <w:p>
+      <w:pPr>
         <w:pStyle w:val="Heading3"/>
       </w:pPr>
-      <w:bookmarkStart w:id="6" w:name="_Toc220996055"/>
       <w:r>
         <w:t>Tổng quát</w:t>
       </w:r>
@@ -3637,43 +3666,17 @@
       <w:bookmarkEnd w:id="8"/>
     </w:p>
     <w:p>
-      <w:pPr>
-        <w:pStyle w:val="Heading4"/>
-      </w:pPr>
       <w:r>
-        <w:t>Admin</w:t>
+        <w:t>Hệ thống gồm có các tác nhân là Quản trị viên (Admin), PO (Product Owner), Member và Khách (Guest). Khách có vai trò là người dùng khi chưa đăng nhập hệ thống. PO và Member đăng nhập vào hệ thống, được cung cấp các chức năng dự án, riêng PO có thể quản lý được Member. Quản trị viên có vai trì quản trị hoạt động của hệ thống.</w:t>
       </w:r>
+      <w:bookmarkStart w:id="9" w:name="_Toc220996058"/>
     </w:p>
     <w:p>
       <w:pPr>
-        <w:pStyle w:val="Heading4"/>
+        <w:pStyle w:val="Heading3"/>
       </w:pPr>
       <w:r>
-        <w:t>Project Owner</w:t>
-      </w:r>
-    </w:p>
-    <w:p>
-      <w:pPr>
-        <w:pStyle w:val="Heading4"/>
-      </w:pPr>
-      <w:r>
-        <w:t>Member</w:t>
-      </w:r>
-    </w:p>
-    <w:p>
-      <w:pPr>
-        <w:pStyle w:val="Heading4"/>
-      </w:pPr>
-      <w:r>
-        <w:t>Guest</w:t>
-      </w:r>
-    </w:p>
-    <w:p>
-      <w:pPr>
-        <w:pStyle w:val="Heading3"/>
-      </w:pPr>
-      <w:bookmarkStart w:id="9" w:name="_Toc220996058"/>
-      <w:r>
+        <w:lastRenderedPageBreak/>
         <w:t>Các chức năng của hệ thống</w:t>
       </w:r>
       <w:bookmarkEnd w:id="9"/>
@@ -3685,6 +3688,15 @@
       <w:r>
         <w:t>Đăng ký</w:t>
       </w:r>
+      <w:r>
+        <w:t xml:space="preserve">: </w:t>
+      </w:r>
+      <w:r>
+        <w:t>Để truy cập sử dụng hệ thống thì Người dùng trước hết cần đăng ký tài khoản</w:t>
+      </w:r>
+      <w:r>
+        <w:t>.</w:t>
+      </w:r>
     </w:p>
     <w:p>
       <w:pPr>
@@ -3693,13 +3705,14 @@
       <w:r>
         <w:t>Đăng nhập</w:t>
       </w:r>
-    </w:p>
-    <w:p>
-      <w:pPr>
-        <w:pStyle w:val="Heading4"/>
-      </w:pPr>
       <w:r>
-        <w:t>Quản lý Project</w:t>
+        <w:t xml:space="preserve">: </w:t>
+      </w:r>
+      <w:r>
+        <w:t>Chức năng này nhằm mục đích xác thực người dùng khi tương tác với hệ thống nhằm cung cấp quyền cũng như phạm vi truy cập hệ thống</w:t>
+      </w:r>
+      <w:r>
+        <w:t>.</w:t>
       </w:r>
     </w:p>
     <w:p>
@@ -3707,23 +3720,24 @@
         <w:pStyle w:val="Heading4"/>
       </w:pPr>
       <w:r>
-        <w:t>Quản lý Task</w:t>
+        <w:t xml:space="preserve">Quản lý </w:t>
+      </w:r>
+      <w:r>
+        <w:t xml:space="preserve">người dùng: </w:t>
+      </w:r>
+      <w:r>
+        <w:t>Quản trị viên có vai trò quản trị những người dùng trong hệ thống</w:t>
+      </w:r>
+      <w:r>
+        <w:t xml:space="preserve">. Có thể cập nhật các tính năng của những người dùng khác. </w:t>
       </w:r>
     </w:p>
     <w:p>
       <w:pPr>
-        <w:pStyle w:val="Heading4"/>
+        <w:ind w:firstLine="720"/>
       </w:pPr>
       <w:r>
-        <w:t>Biểu đồ dạng Board</w:t>
-      </w:r>
-    </w:p>
-    <w:p>
-      <w:pPr>
-        <w:pStyle w:val="Heading4"/>
-      </w:pPr>
-      <w:r>
-        <w:t>Thông báo real-time</w:t>
+        <w:t>Để có thể hình dung rõ hơn về các tác nhân cũng như yêu cầu chức năng của hệ thống bằng cách mô hình hóa chúng dưới các sơ đồ use cases, các sơ đồ sẽ được trình bày phía sau.</w:t>
       </w:r>
     </w:p>
     <w:p>
@@ -3737,6 +3751,11 @@
       <w:bookmarkEnd w:id="10"/>
     </w:p>
     <w:p>
+      <w:r>
+        <w:t>Biểu đồ Use Case tổng quan Hệ thống bao gồm các nhóm use case chính: quản lý người dùng, quản lý project, quản lý task và tương tác nhóm.</w:t>
+      </w:r>
+    </w:p>
+    <w:p>
       <w:pPr>
         <w:pStyle w:val="Heading3"/>
       </w:pPr>
@@ -3759,15 +3778,6 @@
         <w:pStyle w:val="Heading4"/>
       </w:pPr>
       <w:r>
-        <w:lastRenderedPageBreak/>
-        <w:t>Project Manager</w:t>
-      </w:r>
-    </w:p>
-    <w:p>
-      <w:pPr>
-        <w:pStyle w:val="Heading4"/>
-      </w:pPr>
-      <w:r>
         <w:t>Project Owner</w:t>
       </w:r>
     </w:p>
@@ -3777,6 +3787,14 @@
       </w:pPr>
       <w:r>
         <w:t>Member</w:t>
+      </w:r>
+    </w:p>
+    <w:p>
+      <w:pPr>
+        <w:pStyle w:val="Heading4"/>
+      </w:pPr>
+      <w:r>
+        <w:t>Guest</w:t>
       </w:r>
     </w:p>
     <w:p>
@@ -3799,10 +3817,65 @@
     </w:p>
     <w:p>
       <w:pPr>
+        <w:ind w:firstLine="720"/>
+      </w:pPr>
+      <w:r>
+        <w:t xml:space="preserve">Khách có thể đăng ký để tạo ra tài khoản cho mình. Sau đó có thể đăng nhập để sử dụng các chức năng của phần mềm. Nếu khách quên mật khẩu, khách có thể yêu cầu hệ thống cho phép mình thiết lập lại mật khẩu. Lúc này, hệ thống sẽ gửi liên kết qua email đã đăng ký và có thể vào liên kết đó để thực hiện việc thiết lập lại mật khẩu. Sau khi đăng nhập </w:t>
+      </w:r>
+      <w:r>
+        <w:lastRenderedPageBreak/>
+        <w:t>thành công vào hệ thống, người dùng có thể sử dụng các chức năng như Xem và cập nhật thông tin cá nhân của mình, Thay đổi mật khẩu, và các chức năng trong phạm vi của mình mà hệ thống đã cấp phát.</w:t>
+      </w:r>
+    </w:p>
+    <w:p>
+      <w:pPr>
+        <w:ind w:firstLine="360"/>
+      </w:pPr>
+      <w:r>
+        <w:drawing>
+          <wp:inline distT="0" distB="0" distL="0" distR="0" wp14:anchorId="37F7A1A3" wp14:editId="3200B212">
+            <wp:extent cx="5706271" cy="6487430"/>
+            <wp:effectExtent l="0" t="0" r="8890" b="8890"/>
+            <wp:docPr id="1329281969" name="Picture 1"/>
+            <wp:cNvGraphicFramePr>
+              <a:graphicFrameLocks xmlns:a="http://schemas.openxmlformats.org/drawingml/2006/main" noChangeAspect="1"/>
+            </wp:cNvGraphicFramePr>
+            <a:graphic xmlns:a="http://schemas.openxmlformats.org/drawingml/2006/main">
+              <a:graphicData uri="http://schemas.openxmlformats.org/drawingml/2006/picture">
+                <pic:pic xmlns:pic="http://schemas.openxmlformats.org/drawingml/2006/picture">
+                  <pic:nvPicPr>
+                    <pic:cNvPr id="1329281969" name=""/>
+                    <pic:cNvPicPr/>
+                  </pic:nvPicPr>
+                  <pic:blipFill>
+                    <a:blip r:embed="rId11"/>
+                    <a:stretch>
+                      <a:fillRect/>
+                    </a:stretch>
+                  </pic:blipFill>
+                  <pic:spPr>
+                    <a:xfrm>
+                      <a:off x="0" y="0"/>
+                      <a:ext cx="5706271" cy="6487430"/>
+                    </a:xfrm>
+                    <a:prstGeom prst="rect">
+                      <a:avLst/>
+                    </a:prstGeom>
+                  </pic:spPr>
+                </pic:pic>
+              </a:graphicData>
+            </a:graphic>
+          </wp:inline>
+        </w:drawing>
+      </w:r>
+    </w:p>
+    <w:p>
+      <w:pPr>
         <w:pStyle w:val="Heading3"/>
       </w:pPr>
       <w:bookmarkStart w:id="13" w:name="_Toc220996062"/>
       <w:r>
+        <w:lastRenderedPageBreak/>
         <w:t>Đặc tả các usecase</w:t>
       </w:r>
       <w:bookmarkEnd w:id="13"/>
@@ -3863,7 +3936,7 @@
       </w:pPr>
     </w:p>
     <w:sectPr>
-      <w:footerReference w:type="default" r:id="rId11"/>
+      <w:footerReference w:type="default" r:id="rId12"/>
       <w:pgSz w:w="12240" w:h="15840"/>
       <w:pgMar w:top="1138" w:right="1138" w:bottom="1411" w:left="1699" w:header="720" w:footer="720" w:gutter="0"/>
       <w:pgNumType w:start="1"/>
@@ -6948,6 +7021,119 @@
     </w:lvl>
   </w:abstractNum>
   <w:abstractNum w:abstractNumId="27" w15:restartNumberingAfterBreak="0">
+    <w:nsid w:val="5E9954DA"/>
+    <w:multiLevelType w:val="hybridMultilevel"/>
+    <w:tmpl w:val="D118FDE4"/>
+    <w:lvl w:ilvl="0" w:tplc="04090001">
+      <w:start w:val="1"/>
+      <w:numFmt w:val="bullet"/>
+      <w:lvlText w:val=""/>
+      <w:lvlJc w:val="left"/>
+      <w:pPr>
+        <w:ind w:left="1008" w:hanging="360"/>
+      </w:pPr>
+      <w:rPr>
+        <w:rFonts w:ascii="Symbol" w:hAnsi="Symbol" w:hint="default"/>
+      </w:rPr>
+    </w:lvl>
+    <w:lvl w:ilvl="1" w:tplc="04090003" w:tentative="1">
+      <w:start w:val="1"/>
+      <w:numFmt w:val="bullet"/>
+      <w:lvlText w:val="o"/>
+      <w:lvlJc w:val="left"/>
+      <w:pPr>
+        <w:ind w:left="1728" w:hanging="360"/>
+      </w:pPr>
+      <w:rPr>
+        <w:rFonts w:ascii="Courier New" w:hAnsi="Courier New" w:cs="Courier New" w:hint="default"/>
+      </w:rPr>
+    </w:lvl>
+    <w:lvl w:ilvl="2" w:tplc="04090005" w:tentative="1">
+      <w:start w:val="1"/>
+      <w:numFmt w:val="bullet"/>
+      <w:lvlText w:val=""/>
+      <w:lvlJc w:val="left"/>
+      <w:pPr>
+        <w:ind w:left="2448" w:hanging="360"/>
+      </w:pPr>
+      <w:rPr>
+        <w:rFonts w:ascii="Wingdings" w:hAnsi="Wingdings" w:hint="default"/>
+      </w:rPr>
+    </w:lvl>
+    <w:lvl w:ilvl="3" w:tplc="04090001" w:tentative="1">
+      <w:start w:val="1"/>
+      <w:numFmt w:val="bullet"/>
+      <w:lvlText w:val=""/>
+      <w:lvlJc w:val="left"/>
+      <w:pPr>
+        <w:ind w:left="3168" w:hanging="360"/>
+      </w:pPr>
+      <w:rPr>
+        <w:rFonts w:ascii="Symbol" w:hAnsi="Symbol" w:hint="default"/>
+      </w:rPr>
+    </w:lvl>
+    <w:lvl w:ilvl="4" w:tplc="04090003" w:tentative="1">
+      <w:start w:val="1"/>
+      <w:numFmt w:val="bullet"/>
+      <w:lvlText w:val="o"/>
+      <w:lvlJc w:val="left"/>
+      <w:pPr>
+        <w:ind w:left="3888" w:hanging="360"/>
+      </w:pPr>
+      <w:rPr>
+        <w:rFonts w:ascii="Courier New" w:hAnsi="Courier New" w:cs="Courier New" w:hint="default"/>
+      </w:rPr>
+    </w:lvl>
+    <w:lvl w:ilvl="5" w:tplc="04090005" w:tentative="1">
+      <w:start w:val="1"/>
+      <w:numFmt w:val="bullet"/>
+      <w:lvlText w:val=""/>
+      <w:lvlJc w:val="left"/>
+      <w:pPr>
+        <w:ind w:left="4608" w:hanging="360"/>
+      </w:pPr>
+      <w:rPr>
+        <w:rFonts w:ascii="Wingdings" w:hAnsi="Wingdings" w:hint="default"/>
+      </w:rPr>
+    </w:lvl>
+    <w:lvl w:ilvl="6" w:tplc="04090001" w:tentative="1">
+      <w:start w:val="1"/>
+      <w:numFmt w:val="bullet"/>
+      <w:lvlText w:val=""/>
+      <w:lvlJc w:val="left"/>
+      <w:pPr>
+        <w:ind w:left="5328" w:hanging="360"/>
+      </w:pPr>
+      <w:rPr>
+        <w:rFonts w:ascii="Symbol" w:hAnsi="Symbol" w:hint="default"/>
+      </w:rPr>
+    </w:lvl>
+    <w:lvl w:ilvl="7" w:tplc="04090003" w:tentative="1">
+      <w:start w:val="1"/>
+      <w:numFmt w:val="bullet"/>
+      <w:lvlText w:val="o"/>
+      <w:lvlJc w:val="left"/>
+      <w:pPr>
+        <w:ind w:left="6048" w:hanging="360"/>
+      </w:pPr>
+      <w:rPr>
+        <w:rFonts w:ascii="Courier New" w:hAnsi="Courier New" w:cs="Courier New" w:hint="default"/>
+      </w:rPr>
+    </w:lvl>
+    <w:lvl w:ilvl="8" w:tplc="04090005" w:tentative="1">
+      <w:start w:val="1"/>
+      <w:numFmt w:val="bullet"/>
+      <w:lvlText w:val=""/>
+      <w:lvlJc w:val="left"/>
+      <w:pPr>
+        <w:ind w:left="6768" w:hanging="360"/>
+      </w:pPr>
+      <w:rPr>
+        <w:rFonts w:ascii="Wingdings" w:hAnsi="Wingdings" w:hint="default"/>
+      </w:rPr>
+    </w:lvl>
+  </w:abstractNum>
+  <w:abstractNum w:abstractNumId="28" w15:restartNumberingAfterBreak="0">
     <w:nsid w:val="61670855"/>
     <w:multiLevelType w:val="hybridMultilevel"/>
     <w:tmpl w:val="1616A58C"/>
@@ -7060,7 +7246,7 @@
       </w:rPr>
     </w:lvl>
   </w:abstractNum>
-  <w:abstractNum w:abstractNumId="28" w15:restartNumberingAfterBreak="0">
+  <w:abstractNum w:abstractNumId="29" w15:restartNumberingAfterBreak="0">
     <w:nsid w:val="66546FF2"/>
     <w:multiLevelType w:val="hybridMultilevel"/>
     <w:tmpl w:val="9ADC8252"/>
@@ -7172,7 +7358,7 @@
       </w:rPr>
     </w:lvl>
   </w:abstractNum>
-  <w:abstractNum w:abstractNumId="29" w15:restartNumberingAfterBreak="0">
+  <w:abstractNum w:abstractNumId="30" w15:restartNumberingAfterBreak="0">
     <w:nsid w:val="69313994"/>
     <w:multiLevelType w:val="hybridMultilevel"/>
     <w:tmpl w:val="21D658C8"/>
@@ -7285,7 +7471,7 @@
       </w:rPr>
     </w:lvl>
   </w:abstractNum>
-  <w:abstractNum w:abstractNumId="30" w15:restartNumberingAfterBreak="0">
+  <w:abstractNum w:abstractNumId="31" w15:restartNumberingAfterBreak="0">
     <w:nsid w:val="6A477B2A"/>
     <w:multiLevelType w:val="hybridMultilevel"/>
     <w:tmpl w:val="7D548D3C"/>
@@ -7397,7 +7583,7 @@
       </w:rPr>
     </w:lvl>
   </w:abstractNum>
-  <w:abstractNum w:abstractNumId="31" w15:restartNumberingAfterBreak="0">
+  <w:abstractNum w:abstractNumId="32" w15:restartNumberingAfterBreak="0">
     <w:nsid w:val="6E016A80"/>
     <w:multiLevelType w:val="hybridMultilevel"/>
     <w:tmpl w:val="19F07A2C"/>
@@ -7509,7 +7695,7 @@
       </w:rPr>
     </w:lvl>
   </w:abstractNum>
-  <w:abstractNum w:abstractNumId="32" w15:restartNumberingAfterBreak="0">
+  <w:abstractNum w:abstractNumId="33" w15:restartNumberingAfterBreak="0">
     <w:nsid w:val="708167F1"/>
     <w:multiLevelType w:val="hybridMultilevel"/>
     <w:tmpl w:val="BB7E831C"/>
@@ -7621,7 +7807,7 @@
       </w:rPr>
     </w:lvl>
   </w:abstractNum>
-  <w:abstractNum w:abstractNumId="33" w15:restartNumberingAfterBreak="0">
+  <w:abstractNum w:abstractNumId="34" w15:restartNumberingAfterBreak="0">
     <w:nsid w:val="70E30877"/>
     <w:multiLevelType w:val="hybridMultilevel"/>
     <w:tmpl w:val="31980276"/>
@@ -7733,7 +7919,7 @@
       </w:rPr>
     </w:lvl>
   </w:abstractNum>
-  <w:abstractNum w:abstractNumId="34" w15:restartNumberingAfterBreak="0">
+  <w:abstractNum w:abstractNumId="35" w15:restartNumberingAfterBreak="0">
     <w:nsid w:val="741758E2"/>
     <w:multiLevelType w:val="multilevel"/>
     <w:tmpl w:val="DCFA18EA"/>
@@ -7881,7 +8067,7 @@
       </w:rPr>
     </w:lvl>
   </w:abstractNum>
-  <w:abstractNum w:abstractNumId="35" w15:restartNumberingAfterBreak="0">
+  <w:abstractNum w:abstractNumId="36" w15:restartNumberingAfterBreak="0">
     <w:nsid w:val="79226349"/>
     <w:multiLevelType w:val="hybridMultilevel"/>
     <w:tmpl w:val="31C22870"/>
@@ -7993,7 +8179,7 @@
       </w:rPr>
     </w:lvl>
   </w:abstractNum>
-  <w:abstractNum w:abstractNumId="36" w15:restartNumberingAfterBreak="0">
+  <w:abstractNum w:abstractNumId="37" w15:restartNumberingAfterBreak="0">
     <w:nsid w:val="7D7F4046"/>
     <w:multiLevelType w:val="hybridMultilevel"/>
     <w:tmpl w:val="0EC6249E"/>
@@ -8113,19 +8299,19 @@
     </w:lvlOverride>
   </w:num>
   <w:num w:numId="3" w16cid:durableId="2083945052">
-    <w:abstractNumId w:val="36"/>
+    <w:abstractNumId w:val="37"/>
   </w:num>
   <w:num w:numId="4" w16cid:durableId="1064599196">
     <w:abstractNumId w:val="16"/>
   </w:num>
   <w:num w:numId="5" w16cid:durableId="675885295">
-    <w:abstractNumId w:val="32"/>
+    <w:abstractNumId w:val="33"/>
   </w:num>
   <w:num w:numId="6" w16cid:durableId="968317092">
     <w:abstractNumId w:val="22"/>
   </w:num>
   <w:num w:numId="7" w16cid:durableId="1185481116">
-    <w:abstractNumId w:val="35"/>
+    <w:abstractNumId w:val="36"/>
   </w:num>
   <w:num w:numId="8" w16cid:durableId="1464882302">
     <w:abstractNumId w:val="6"/>
@@ -8140,7 +8326,7 @@
     <w:abstractNumId w:val="12"/>
   </w:num>
   <w:num w:numId="12" w16cid:durableId="460347803">
-    <w:abstractNumId w:val="28"/>
+    <w:abstractNumId w:val="29"/>
   </w:num>
   <w:num w:numId="13" w16cid:durableId="352461228">
     <w:abstractNumId w:val="4"/>
@@ -8188,19 +8374,19 @@
     <w:abstractNumId w:val="7"/>
   </w:num>
   <w:num w:numId="19" w16cid:durableId="1708800650">
-    <w:abstractNumId w:val="27"/>
+    <w:abstractNumId w:val="28"/>
   </w:num>
   <w:num w:numId="20" w16cid:durableId="896554941">
     <w:abstractNumId w:val="18"/>
   </w:num>
   <w:num w:numId="21" w16cid:durableId="685400493">
-    <w:abstractNumId w:val="29"/>
+    <w:abstractNumId w:val="30"/>
   </w:num>
   <w:num w:numId="22" w16cid:durableId="2090809066">
-    <w:abstractNumId w:val="31"/>
+    <w:abstractNumId w:val="32"/>
   </w:num>
   <w:num w:numId="23" w16cid:durableId="1094938280">
-    <w:abstractNumId w:val="30"/>
+    <w:abstractNumId w:val="31"/>
   </w:num>
   <w:num w:numId="24" w16cid:durableId="568421877">
     <w:abstractNumId w:val="5"/>
@@ -8215,13 +8401,13 @@
     <w:abstractNumId w:val="26"/>
   </w:num>
   <w:num w:numId="28" w16cid:durableId="1955596852">
-    <w:abstractNumId w:val="33"/>
+    <w:abstractNumId w:val="34"/>
   </w:num>
   <w:num w:numId="29" w16cid:durableId="1800806099">
     <w:abstractNumId w:val="11"/>
   </w:num>
   <w:num w:numId="30" w16cid:durableId="820198910">
-    <w:abstractNumId w:val="34"/>
+    <w:abstractNumId w:val="35"/>
   </w:num>
   <w:num w:numId="31" w16cid:durableId="2110195940">
     <w:abstractNumId w:val="15"/>
@@ -8249,6 +8435,9 @@
   </w:num>
   <w:num w:numId="39" w16cid:durableId="1091244190">
     <w:abstractNumId w:val="21"/>
+  </w:num>
+  <w:num w:numId="40" w16cid:durableId="1224172225">
+    <w:abstractNumId w:val="27"/>
   </w:num>
 </w:numbering>
 </file>
@@ -8894,7 +9083,6 @@
   <w:style w:type="character" w:default="1" w:styleId="DefaultParagraphFont">
     <w:name w:val="Default Paragraph Font"/>
     <w:uiPriority w:val="1"/>
-    <w:semiHidden/>
     <w:unhideWhenUsed/>
   </w:style>
   <w:style w:type="table" w:default="1" w:styleId="TableNormal">

</xml_diff>

<commit_message>
Cập nhật word SRS chương 2.6 và khởi tạo project
</commit_message>
<xml_diff>
--- a/SRS.docx
+++ b/SRS.docx
@@ -3778,7 +3778,13 @@
         <w:pStyle w:val="Heading4"/>
       </w:pPr>
       <w:r>
-        <w:t>Project Owner</w:t>
+        <w:t>P</w:t>
+      </w:r>
+      <w:r>
+        <w:t>roduct</w:t>
+      </w:r>
+      <w:r>
+        <w:t xml:space="preserve"> Owner</w:t>
       </w:r>
     </w:p>
     <w:p>
@@ -3786,6 +3792,14 @@
         <w:pStyle w:val="Heading4"/>
       </w:pPr>
       <w:r>
+        <w:t>Project Manager</w:t>
+      </w:r>
+    </w:p>
+    <w:p>
+      <w:pPr>
+        <w:pStyle w:val="Heading4"/>
+      </w:pPr>
+      <w:r>
         <w:t>Member</w:t>
       </w:r>
     </w:p>
@@ -3820,23 +3834,27 @@
         <w:ind w:firstLine="720"/>
       </w:pPr>
       <w:r>
-        <w:t xml:space="preserve">Khách có thể đăng ký để tạo ra tài khoản cho mình. Sau đó có thể đăng nhập để sử dụng các chức năng của phần mềm. Nếu khách quên mật khẩu, khách có thể yêu cầu hệ thống cho phép mình thiết lập lại mật khẩu. Lúc này, hệ thống sẽ gửi liên kết qua email đã đăng ký và có thể vào liên kết đó để thực hiện việc thiết lập lại mật khẩu. Sau khi đăng nhập </w:t>
+        <w:t xml:space="preserve">Khách có thể đăng ký để tạo ra tài khoản cho mình. Sau đó có thể đăng nhập để sử dụng các chức năng của phần mềm. Nếu khách quên mật khẩu, khách có thể yêu cầu hệ </w:t>
       </w:r>
       <w:r>
         <w:lastRenderedPageBreak/>
-        <w:t>thành công vào hệ thống, người dùng có thể sử dụng các chức năng như Xem và cập nhật thông tin cá nhân của mình, Thay đổi mật khẩu, và các chức năng trong phạm vi của mình mà hệ thống đã cấp phát.</w:t>
-      </w:r>
-    </w:p>
-    <w:p>
-      <w:pPr>
-        <w:ind w:firstLine="360"/>
-      </w:pPr>
-      <w:r>
+        <w:t>thống cho phép mình thiết lập lại mật khẩu. Lúc này, hệ thống sẽ gửi liên kết qua email đã đăng ký và có thể vào liên kết đó để thực hiện việc thiết lập lại mật khẩu. Sau khi đăng nhập thành công vào hệ thống, người dùng có thể sử dụng các chức năng như Xem và cập nhật thông tin cá nhân của mình, Thay đổi mật khẩu, và các chức năng trong phạm vi của mình mà hệ thống đã cấp phát.</w:t>
+      </w:r>
+    </w:p>
+    <w:p>
+      <w:pPr>
+        <w:ind w:firstLine="0"/>
+      </w:pPr>
+      <w:r>
+        <w:rPr>
+          <w:noProof/>
+        </w:rPr>
+        <w:lastRenderedPageBreak/>
         <w:drawing>
-          <wp:inline distT="0" distB="0" distL="0" distR="0" wp14:anchorId="37F7A1A3" wp14:editId="3200B212">
-            <wp:extent cx="5706271" cy="6487430"/>
-            <wp:effectExtent l="0" t="0" r="8890" b="8890"/>
-            <wp:docPr id="1329281969" name="Picture 1"/>
+          <wp:inline distT="0" distB="0" distL="0" distR="0" wp14:anchorId="54E01383" wp14:editId="0903B9B9">
+            <wp:extent cx="5970905" cy="7285990"/>
+            <wp:effectExtent l="0" t="0" r="0" b="0"/>
+            <wp:docPr id="510645687" name="Picture 1"/>
             <wp:cNvGraphicFramePr>
               <a:graphicFrameLocks xmlns:a="http://schemas.openxmlformats.org/drawingml/2006/main" noChangeAspect="1"/>
             </wp:cNvGraphicFramePr>
@@ -3844,11 +3862,17 @@
               <a:graphicData uri="http://schemas.openxmlformats.org/drawingml/2006/picture">
                 <pic:pic xmlns:pic="http://schemas.openxmlformats.org/drawingml/2006/picture">
                   <pic:nvPicPr>
-                    <pic:cNvPr id="1329281969" name=""/>
+                    <pic:cNvPr id="510645687" name="Picture 510645687"/>
                     <pic:cNvPicPr/>
                   </pic:nvPicPr>
                   <pic:blipFill>
-                    <a:blip r:embed="rId11"/>
+                    <a:blip r:embed="rId11">
+                      <a:extLst>
+                        <a:ext uri="{28A0092B-C50C-407E-A947-70E740481C1C}">
+                          <a14:useLocalDpi xmlns:a14="http://schemas.microsoft.com/office/drawing/2010/main" val="0"/>
+                        </a:ext>
+                      </a:extLst>
+                    </a:blip>
                     <a:stretch>
                       <a:fillRect/>
                     </a:stretch>
@@ -3856,7 +3880,7 @@
                   <pic:spPr>
                     <a:xfrm>
                       <a:off x="0" y="0"/>
-                      <a:ext cx="5706271" cy="6487430"/>
+                      <a:ext cx="5970905" cy="7285990"/>
                     </a:xfrm>
                     <a:prstGeom prst="rect">
                       <a:avLst/>
@@ -3879,6 +3903,598 @@
         <w:t>Đặc tả các usecase</w:t>
       </w:r>
       <w:bookmarkEnd w:id="13"/>
+    </w:p>
+    <w:p>
+      <w:pPr>
+        <w:pStyle w:val="Heading4"/>
+      </w:pPr>
+      <w:r>
+        <w:t xml:space="preserve">Đăng </w:t>
+      </w:r>
+      <w:r>
+        <w:t xml:space="preserve">nhập hệ thống </w:t>
+      </w:r>
+    </w:p>
+    <w:p>
+      <w:r>
+        <w:rPr>
+          <w:noProof/>
+        </w:rPr>
+        <w:drawing>
+          <wp:inline distT="0" distB="0" distL="0" distR="0" wp14:anchorId="5BF57E08" wp14:editId="1DD11DEE">
+            <wp:extent cx="5970905" cy="4767580"/>
+            <wp:effectExtent l="0" t="0" r="0" b="0"/>
+            <wp:docPr id="277900427" name="Picture 1"/>
+            <wp:cNvGraphicFramePr>
+              <a:graphicFrameLocks xmlns:a="http://schemas.openxmlformats.org/drawingml/2006/main" noChangeAspect="1"/>
+            </wp:cNvGraphicFramePr>
+            <a:graphic xmlns:a="http://schemas.openxmlformats.org/drawingml/2006/main">
+              <a:graphicData uri="http://schemas.openxmlformats.org/drawingml/2006/picture">
+                <pic:pic xmlns:pic="http://schemas.openxmlformats.org/drawingml/2006/picture">
+                  <pic:nvPicPr>
+                    <pic:cNvPr id="277900427" name=""/>
+                    <pic:cNvPicPr/>
+                  </pic:nvPicPr>
+                  <pic:blipFill>
+                    <a:blip r:embed="rId12"/>
+                    <a:stretch>
+                      <a:fillRect/>
+                    </a:stretch>
+                  </pic:blipFill>
+                  <pic:spPr>
+                    <a:xfrm>
+                      <a:off x="0" y="0"/>
+                      <a:ext cx="5970905" cy="4767580"/>
+                    </a:xfrm>
+                    <a:prstGeom prst="rect">
+                      <a:avLst/>
+                    </a:prstGeom>
+                  </pic:spPr>
+                </pic:pic>
+              </a:graphicData>
+            </a:graphic>
+          </wp:inline>
+        </w:drawing>
+      </w:r>
+    </w:p>
+    <w:p>
+      <w:pPr>
+        <w:pStyle w:val="Heading4"/>
+      </w:pPr>
+      <w:r>
+        <w:lastRenderedPageBreak/>
+        <w:t xml:space="preserve">Đăng </w:t>
+      </w:r>
+      <w:r>
+        <w:t>ký tài khoản</w:t>
+      </w:r>
+    </w:p>
+    <w:p>
+      <w:r>
+        <w:drawing>
+          <wp:inline distT="0" distB="0" distL="0" distR="0" wp14:anchorId="0976E8F0" wp14:editId="1268168A">
+            <wp:extent cx="5970905" cy="4826635"/>
+            <wp:effectExtent l="0" t="0" r="0" b="0"/>
+            <wp:docPr id="381175095" name="Picture 1"/>
+            <wp:cNvGraphicFramePr>
+              <a:graphicFrameLocks xmlns:a="http://schemas.openxmlformats.org/drawingml/2006/main" noChangeAspect="1"/>
+            </wp:cNvGraphicFramePr>
+            <a:graphic xmlns:a="http://schemas.openxmlformats.org/drawingml/2006/main">
+              <a:graphicData uri="http://schemas.openxmlformats.org/drawingml/2006/picture">
+                <pic:pic xmlns:pic="http://schemas.openxmlformats.org/drawingml/2006/picture">
+                  <pic:nvPicPr>
+                    <pic:cNvPr id="381175095" name=""/>
+                    <pic:cNvPicPr/>
+                  </pic:nvPicPr>
+                  <pic:blipFill>
+                    <a:blip r:embed="rId13"/>
+                    <a:stretch>
+                      <a:fillRect/>
+                    </a:stretch>
+                  </pic:blipFill>
+                  <pic:spPr>
+                    <a:xfrm>
+                      <a:off x="0" y="0"/>
+                      <a:ext cx="5970905" cy="4826635"/>
+                    </a:xfrm>
+                    <a:prstGeom prst="rect">
+                      <a:avLst/>
+                    </a:prstGeom>
+                  </pic:spPr>
+                </pic:pic>
+              </a:graphicData>
+            </a:graphic>
+          </wp:inline>
+        </w:drawing>
+      </w:r>
+    </w:p>
+    <w:p>
+      <w:pPr>
+        <w:pStyle w:val="Heading4"/>
+      </w:pPr>
+      <w:r>
+        <w:lastRenderedPageBreak/>
+        <w:t>Thay đổi mật khẩu</w:t>
+      </w:r>
+    </w:p>
+    <w:p>
+      <w:r>
+        <w:rPr>
+          <w:noProof/>
+        </w:rPr>
+        <w:drawing>
+          <wp:inline distT="0" distB="0" distL="0" distR="0" wp14:anchorId="148FFCE8" wp14:editId="2FDBD0F7">
+            <wp:extent cx="5970905" cy="3683635"/>
+            <wp:effectExtent l="0" t="0" r="0" b="0"/>
+            <wp:docPr id="1224103013" name="Picture 1"/>
+            <wp:cNvGraphicFramePr>
+              <a:graphicFrameLocks xmlns:a="http://schemas.openxmlformats.org/drawingml/2006/main" noChangeAspect="1"/>
+            </wp:cNvGraphicFramePr>
+            <a:graphic xmlns:a="http://schemas.openxmlformats.org/drawingml/2006/main">
+              <a:graphicData uri="http://schemas.openxmlformats.org/drawingml/2006/picture">
+                <pic:pic xmlns:pic="http://schemas.openxmlformats.org/drawingml/2006/picture">
+                  <pic:nvPicPr>
+                    <pic:cNvPr id="1224103013" name=""/>
+                    <pic:cNvPicPr/>
+                  </pic:nvPicPr>
+                  <pic:blipFill>
+                    <a:blip r:embed="rId14"/>
+                    <a:stretch>
+                      <a:fillRect/>
+                    </a:stretch>
+                  </pic:blipFill>
+                  <pic:spPr>
+                    <a:xfrm>
+                      <a:off x="0" y="0"/>
+                      <a:ext cx="5970905" cy="3683635"/>
+                    </a:xfrm>
+                    <a:prstGeom prst="rect">
+                      <a:avLst/>
+                    </a:prstGeom>
+                  </pic:spPr>
+                </pic:pic>
+              </a:graphicData>
+            </a:graphic>
+          </wp:inline>
+        </w:drawing>
+      </w:r>
+    </w:p>
+    <w:p>
+      <w:pPr>
+        <w:pStyle w:val="Heading4"/>
+      </w:pPr>
+      <w:r>
+        <w:lastRenderedPageBreak/>
+        <w:t>Thiết lập lại mật khẩu</w:t>
+      </w:r>
+    </w:p>
+    <w:p>
+      <w:r>
+        <w:rPr>
+          <w:noProof/>
+        </w:rPr>
+        <w:drawing>
+          <wp:inline distT="0" distB="0" distL="0" distR="0" wp14:anchorId="26B1DF33" wp14:editId="53853BA8">
+            <wp:extent cx="5970905" cy="4625975"/>
+            <wp:effectExtent l="0" t="0" r="0" b="3175"/>
+            <wp:docPr id="827025705" name="Picture 1"/>
+            <wp:cNvGraphicFramePr>
+              <a:graphicFrameLocks xmlns:a="http://schemas.openxmlformats.org/drawingml/2006/main" noChangeAspect="1"/>
+            </wp:cNvGraphicFramePr>
+            <a:graphic xmlns:a="http://schemas.openxmlformats.org/drawingml/2006/main">
+              <a:graphicData uri="http://schemas.openxmlformats.org/drawingml/2006/picture">
+                <pic:pic xmlns:pic="http://schemas.openxmlformats.org/drawingml/2006/picture">
+                  <pic:nvPicPr>
+                    <pic:cNvPr id="827025705" name=""/>
+                    <pic:cNvPicPr/>
+                  </pic:nvPicPr>
+                  <pic:blipFill>
+                    <a:blip r:embed="rId15"/>
+                    <a:stretch>
+                      <a:fillRect/>
+                    </a:stretch>
+                  </pic:blipFill>
+                  <pic:spPr>
+                    <a:xfrm>
+                      <a:off x="0" y="0"/>
+                      <a:ext cx="5970905" cy="4625975"/>
+                    </a:xfrm>
+                    <a:prstGeom prst="rect">
+                      <a:avLst/>
+                    </a:prstGeom>
+                  </pic:spPr>
+                </pic:pic>
+              </a:graphicData>
+            </a:graphic>
+          </wp:inline>
+        </w:drawing>
+      </w:r>
+    </w:p>
+    <w:p>
+      <w:pPr>
+        <w:pStyle w:val="Heading4"/>
+      </w:pPr>
+      <w:r>
+        <w:lastRenderedPageBreak/>
+        <w:t>Cập nhật thông tin các nhân</w:t>
+      </w:r>
+    </w:p>
+    <w:p>
+      <w:r>
+        <w:rPr>
+          <w:noProof/>
+        </w:rPr>
+        <w:drawing>
+          <wp:inline distT="0" distB="0" distL="0" distR="0" wp14:anchorId="75D75F9C" wp14:editId="009A731C">
+            <wp:extent cx="5970905" cy="4401185"/>
+            <wp:effectExtent l="0" t="0" r="0" b="0"/>
+            <wp:docPr id="1570403148" name="Picture 1"/>
+            <wp:cNvGraphicFramePr>
+              <a:graphicFrameLocks xmlns:a="http://schemas.openxmlformats.org/drawingml/2006/main" noChangeAspect="1"/>
+            </wp:cNvGraphicFramePr>
+            <a:graphic xmlns:a="http://schemas.openxmlformats.org/drawingml/2006/main">
+              <a:graphicData uri="http://schemas.openxmlformats.org/drawingml/2006/picture">
+                <pic:pic xmlns:pic="http://schemas.openxmlformats.org/drawingml/2006/picture">
+                  <pic:nvPicPr>
+                    <pic:cNvPr id="1570403148" name=""/>
+                    <pic:cNvPicPr/>
+                  </pic:nvPicPr>
+                  <pic:blipFill>
+                    <a:blip r:embed="rId16"/>
+                    <a:stretch>
+                      <a:fillRect/>
+                    </a:stretch>
+                  </pic:blipFill>
+                  <pic:spPr>
+                    <a:xfrm>
+                      <a:off x="0" y="0"/>
+                      <a:ext cx="5970905" cy="4401185"/>
+                    </a:xfrm>
+                    <a:prstGeom prst="rect">
+                      <a:avLst/>
+                    </a:prstGeom>
+                  </pic:spPr>
+                </pic:pic>
+              </a:graphicData>
+            </a:graphic>
+          </wp:inline>
+        </w:drawing>
+      </w:r>
+    </w:p>
+    <w:p>
+      <w:pPr>
+        <w:pStyle w:val="Heading4"/>
+      </w:pPr>
+      <w:r>
+        <w:lastRenderedPageBreak/>
+        <w:t>Quản lý dự án</w:t>
+      </w:r>
+    </w:p>
+    <w:p>
+      <w:r>
+        <w:drawing>
+          <wp:inline distT="0" distB="0" distL="0" distR="0" wp14:anchorId="581DD38E" wp14:editId="438D3063">
+            <wp:extent cx="5970905" cy="4941570"/>
+            <wp:effectExtent l="0" t="0" r="0" b="0"/>
+            <wp:docPr id="2138023632" name="Picture 1"/>
+            <wp:cNvGraphicFramePr>
+              <a:graphicFrameLocks xmlns:a="http://schemas.openxmlformats.org/drawingml/2006/main" noChangeAspect="1"/>
+            </wp:cNvGraphicFramePr>
+            <a:graphic xmlns:a="http://schemas.openxmlformats.org/drawingml/2006/main">
+              <a:graphicData uri="http://schemas.openxmlformats.org/drawingml/2006/picture">
+                <pic:pic xmlns:pic="http://schemas.openxmlformats.org/drawingml/2006/picture">
+                  <pic:nvPicPr>
+                    <pic:cNvPr id="2138023632" name=""/>
+                    <pic:cNvPicPr/>
+                  </pic:nvPicPr>
+                  <pic:blipFill>
+                    <a:blip r:embed="rId17"/>
+                    <a:stretch>
+                      <a:fillRect/>
+                    </a:stretch>
+                  </pic:blipFill>
+                  <pic:spPr>
+                    <a:xfrm>
+                      <a:off x="0" y="0"/>
+                      <a:ext cx="5970905" cy="4941570"/>
+                    </a:xfrm>
+                    <a:prstGeom prst="rect">
+                      <a:avLst/>
+                    </a:prstGeom>
+                  </pic:spPr>
+                </pic:pic>
+              </a:graphicData>
+            </a:graphic>
+          </wp:inline>
+        </w:drawing>
+      </w:r>
+    </w:p>
+    <w:p>
+      <w:r>
+        <w:lastRenderedPageBreak/>
+        <w:drawing>
+          <wp:inline distT="0" distB="0" distL="0" distR="0" wp14:anchorId="3ACC2162" wp14:editId="29911110">
+            <wp:extent cx="5970905" cy="4330700"/>
+            <wp:effectExtent l="0" t="0" r="0" b="0"/>
+            <wp:docPr id="634618398" name="Picture 1"/>
+            <wp:cNvGraphicFramePr>
+              <a:graphicFrameLocks xmlns:a="http://schemas.openxmlformats.org/drawingml/2006/main" noChangeAspect="1"/>
+            </wp:cNvGraphicFramePr>
+            <a:graphic xmlns:a="http://schemas.openxmlformats.org/drawingml/2006/main">
+              <a:graphicData uri="http://schemas.openxmlformats.org/drawingml/2006/picture">
+                <pic:pic xmlns:pic="http://schemas.openxmlformats.org/drawingml/2006/picture">
+                  <pic:nvPicPr>
+                    <pic:cNvPr id="634618398" name=""/>
+                    <pic:cNvPicPr/>
+                  </pic:nvPicPr>
+                  <pic:blipFill>
+                    <a:blip r:embed="rId18"/>
+                    <a:stretch>
+                      <a:fillRect/>
+                    </a:stretch>
+                  </pic:blipFill>
+                  <pic:spPr>
+                    <a:xfrm>
+                      <a:off x="0" y="0"/>
+                      <a:ext cx="5970905" cy="4330700"/>
+                    </a:xfrm>
+                    <a:prstGeom prst="rect">
+                      <a:avLst/>
+                    </a:prstGeom>
+                  </pic:spPr>
+                </pic:pic>
+              </a:graphicData>
+            </a:graphic>
+          </wp:inline>
+        </w:drawing>
+      </w:r>
+    </w:p>
+    <w:p>
+      <w:pPr>
+        <w:pStyle w:val="Heading4"/>
+      </w:pPr>
+      <w:r>
+        <w:lastRenderedPageBreak/>
+        <w:t>Quản lý nhóm</w:t>
+      </w:r>
+    </w:p>
+    <w:p>
+      <w:r>
+        <w:drawing>
+          <wp:inline distT="0" distB="0" distL="0" distR="0" wp14:anchorId="5F0EEC82" wp14:editId="768A8F32">
+            <wp:extent cx="5970905" cy="5124450"/>
+            <wp:effectExtent l="0" t="0" r="0" b="0"/>
+            <wp:docPr id="1182663259" name="Picture 1"/>
+            <wp:cNvGraphicFramePr>
+              <a:graphicFrameLocks xmlns:a="http://schemas.openxmlformats.org/drawingml/2006/main" noChangeAspect="1"/>
+            </wp:cNvGraphicFramePr>
+            <a:graphic xmlns:a="http://schemas.openxmlformats.org/drawingml/2006/main">
+              <a:graphicData uri="http://schemas.openxmlformats.org/drawingml/2006/picture">
+                <pic:pic xmlns:pic="http://schemas.openxmlformats.org/drawingml/2006/picture">
+                  <pic:nvPicPr>
+                    <pic:cNvPr id="1182663259" name=""/>
+                    <pic:cNvPicPr/>
+                  </pic:nvPicPr>
+                  <pic:blipFill>
+                    <a:blip r:embed="rId19"/>
+                    <a:stretch>
+                      <a:fillRect/>
+                    </a:stretch>
+                  </pic:blipFill>
+                  <pic:spPr>
+                    <a:xfrm>
+                      <a:off x="0" y="0"/>
+                      <a:ext cx="5970905" cy="5124450"/>
+                    </a:xfrm>
+                    <a:prstGeom prst="rect">
+                      <a:avLst/>
+                    </a:prstGeom>
+                  </pic:spPr>
+                </pic:pic>
+              </a:graphicData>
+            </a:graphic>
+          </wp:inline>
+        </w:drawing>
+      </w:r>
+    </w:p>
+    <w:p>
+      <w:r>
+        <w:lastRenderedPageBreak/>
+        <w:drawing>
+          <wp:inline distT="0" distB="0" distL="0" distR="0" wp14:anchorId="5CC71622" wp14:editId="306E0E64">
+            <wp:extent cx="5970905" cy="4535170"/>
+            <wp:effectExtent l="0" t="0" r="0" b="0"/>
+            <wp:docPr id="1835178068" name="Picture 1"/>
+            <wp:cNvGraphicFramePr>
+              <a:graphicFrameLocks xmlns:a="http://schemas.openxmlformats.org/drawingml/2006/main" noChangeAspect="1"/>
+            </wp:cNvGraphicFramePr>
+            <a:graphic xmlns:a="http://schemas.openxmlformats.org/drawingml/2006/main">
+              <a:graphicData uri="http://schemas.openxmlformats.org/drawingml/2006/picture">
+                <pic:pic xmlns:pic="http://schemas.openxmlformats.org/drawingml/2006/picture">
+                  <pic:nvPicPr>
+                    <pic:cNvPr id="1835178068" name=""/>
+                    <pic:cNvPicPr/>
+                  </pic:nvPicPr>
+                  <pic:blipFill>
+                    <a:blip r:embed="rId20"/>
+                    <a:stretch>
+                      <a:fillRect/>
+                    </a:stretch>
+                  </pic:blipFill>
+                  <pic:spPr>
+                    <a:xfrm>
+                      <a:off x="0" y="0"/>
+                      <a:ext cx="5970905" cy="4535170"/>
+                    </a:xfrm>
+                    <a:prstGeom prst="rect">
+                      <a:avLst/>
+                    </a:prstGeom>
+                  </pic:spPr>
+                </pic:pic>
+              </a:graphicData>
+            </a:graphic>
+          </wp:inline>
+        </w:drawing>
+      </w:r>
+    </w:p>
+    <w:p>
+      <w:pPr>
+        <w:pStyle w:val="Heading4"/>
+      </w:pPr>
+      <w:r>
+        <w:t>Quản lý công việc</w:t>
+      </w:r>
+    </w:p>
+    <w:p>
+      <w:r>
+        <w:drawing>
+          <wp:inline distT="0" distB="0" distL="0" distR="0" wp14:anchorId="4E8FE7CE" wp14:editId="65514787">
+            <wp:extent cx="5970905" cy="3068320"/>
+            <wp:effectExtent l="0" t="0" r="0" b="0"/>
+            <wp:docPr id="1877430039" name="Picture 1"/>
+            <wp:cNvGraphicFramePr>
+              <a:graphicFrameLocks xmlns:a="http://schemas.openxmlformats.org/drawingml/2006/main" noChangeAspect="1"/>
+            </wp:cNvGraphicFramePr>
+            <a:graphic xmlns:a="http://schemas.openxmlformats.org/drawingml/2006/main">
+              <a:graphicData uri="http://schemas.openxmlformats.org/drawingml/2006/picture">
+                <pic:pic xmlns:pic="http://schemas.openxmlformats.org/drawingml/2006/picture">
+                  <pic:nvPicPr>
+                    <pic:cNvPr id="1877430039" name=""/>
+                    <pic:cNvPicPr/>
+                  </pic:nvPicPr>
+                  <pic:blipFill>
+                    <a:blip r:embed="rId21"/>
+                    <a:stretch>
+                      <a:fillRect/>
+                    </a:stretch>
+                  </pic:blipFill>
+                  <pic:spPr>
+                    <a:xfrm>
+                      <a:off x="0" y="0"/>
+                      <a:ext cx="5970905" cy="3068320"/>
+                    </a:xfrm>
+                    <a:prstGeom prst="rect">
+                      <a:avLst/>
+                    </a:prstGeom>
+                  </pic:spPr>
+                </pic:pic>
+              </a:graphicData>
+            </a:graphic>
+          </wp:inline>
+        </w:drawing>
+      </w:r>
+    </w:p>
+    <w:p>
+      <w:r>
+        <w:lastRenderedPageBreak/>
+        <w:drawing>
+          <wp:inline distT="0" distB="0" distL="0" distR="0" wp14:anchorId="6A9ADBA2" wp14:editId="0B60C199">
+            <wp:extent cx="5970905" cy="4003675"/>
+            <wp:effectExtent l="0" t="0" r="0" b="0"/>
+            <wp:docPr id="593020240" name="Picture 1"/>
+            <wp:cNvGraphicFramePr>
+              <a:graphicFrameLocks xmlns:a="http://schemas.openxmlformats.org/drawingml/2006/main" noChangeAspect="1"/>
+            </wp:cNvGraphicFramePr>
+            <a:graphic xmlns:a="http://schemas.openxmlformats.org/drawingml/2006/main">
+              <a:graphicData uri="http://schemas.openxmlformats.org/drawingml/2006/picture">
+                <pic:pic xmlns:pic="http://schemas.openxmlformats.org/drawingml/2006/picture">
+                  <pic:nvPicPr>
+                    <pic:cNvPr id="593020240" name=""/>
+                    <pic:cNvPicPr/>
+                  </pic:nvPicPr>
+                  <pic:blipFill>
+                    <a:blip r:embed="rId22"/>
+                    <a:stretch>
+                      <a:fillRect/>
+                    </a:stretch>
+                  </pic:blipFill>
+                  <pic:spPr>
+                    <a:xfrm>
+                      <a:off x="0" y="0"/>
+                      <a:ext cx="5970905" cy="4003675"/>
+                    </a:xfrm>
+                    <a:prstGeom prst="rect">
+                      <a:avLst/>
+                    </a:prstGeom>
+                  </pic:spPr>
+                </pic:pic>
+              </a:graphicData>
+            </a:graphic>
+          </wp:inline>
+        </w:drawing>
+      </w:r>
+    </w:p>
+    <w:p>
+      <w:r>
+        <w:lastRenderedPageBreak/>
+        <w:drawing>
+          <wp:inline distT="0" distB="0" distL="0" distR="0" wp14:anchorId="7081A28D" wp14:editId="1318320E">
+            <wp:extent cx="5970905" cy="4321810"/>
+            <wp:effectExtent l="0" t="0" r="0" b="2540"/>
+            <wp:docPr id="234148146" name="Picture 1"/>
+            <wp:cNvGraphicFramePr>
+              <a:graphicFrameLocks xmlns:a="http://schemas.openxmlformats.org/drawingml/2006/main" noChangeAspect="1"/>
+            </wp:cNvGraphicFramePr>
+            <a:graphic xmlns:a="http://schemas.openxmlformats.org/drawingml/2006/main">
+              <a:graphicData uri="http://schemas.openxmlformats.org/drawingml/2006/picture">
+                <pic:pic xmlns:pic="http://schemas.openxmlformats.org/drawingml/2006/picture">
+                  <pic:nvPicPr>
+                    <pic:cNvPr id="234148146" name=""/>
+                    <pic:cNvPicPr/>
+                  </pic:nvPicPr>
+                  <pic:blipFill>
+                    <a:blip r:embed="rId23"/>
+                    <a:stretch>
+                      <a:fillRect/>
+                    </a:stretch>
+                  </pic:blipFill>
+                  <pic:spPr>
+                    <a:xfrm>
+                      <a:off x="0" y="0"/>
+                      <a:ext cx="5970905" cy="4321810"/>
+                    </a:xfrm>
+                    <a:prstGeom prst="rect">
+                      <a:avLst/>
+                    </a:prstGeom>
+                  </pic:spPr>
+                </pic:pic>
+              </a:graphicData>
+            </a:graphic>
+          </wp:inline>
+        </w:drawing>
+      </w:r>
+    </w:p>
+    <w:p>
+      <w:pPr>
+        <w:pStyle w:val="Heading4"/>
+      </w:pPr>
+      <w:r>
+        <w:t>Quản lý chức năng</w:t>
+      </w:r>
+    </w:p>
+    <w:p>
+      <w:pPr>
+        <w:pStyle w:val="Heading4"/>
+      </w:pPr>
+      <w:r>
+        <w:t>Quản lý sprint</w:t>
+      </w:r>
+    </w:p>
+    <w:p>
+      <w:pPr>
+        <w:pStyle w:val="Heading4"/>
+      </w:pPr>
+      <w:r>
+        <w:t>Quản lý issue</w:t>
+      </w:r>
+    </w:p>
+    <w:p>
+      <w:pPr>
+        <w:pStyle w:val="Heading4"/>
+      </w:pPr>
+      <w:r>
+        <w:t>Sắp xếp công việc</w:t>
+      </w:r>
     </w:p>
     <w:p>
       <w:pPr>
@@ -3936,7 +4552,7 @@
       </w:pPr>
     </w:p>
     <w:sectPr>
-      <w:footerReference w:type="default" r:id="rId12"/>
+      <w:footerReference w:type="default" r:id="rId24"/>
       <w:pgSz w:w="12240" w:h="15840"/>
       <w:pgMar w:top="1138" w:right="1138" w:bottom="1411" w:left="1699" w:header="720" w:footer="720" w:gutter="0"/>
       <w:pgNumType w:start="1"/>
@@ -6776,7 +7392,7 @@
   <w:abstractNum w:abstractNumId="25" w15:restartNumberingAfterBreak="0">
     <w:nsid w:val="59850A96"/>
     <w:multiLevelType w:val="multilevel"/>
-    <w:tmpl w:val="E45EA1E2"/>
+    <w:tmpl w:val="0368F544"/>
     <w:lvl w:ilvl="0">
       <w:start w:val="1"/>
       <w:numFmt w:val="none"/>
@@ -8946,7 +9562,7 @@
     <w:uiPriority w:val="9"/>
     <w:unhideWhenUsed/>
     <w:qFormat/>
-    <w:rsid w:val="0007667E"/>
+    <w:rsid w:val="00C76F8A"/>
     <w:pPr>
       <w:keepNext/>
       <w:keepLines/>
@@ -8955,6 +9571,7 @@
         <w:numId w:val="1"/>
       </w:numPr>
       <w:spacing w:before="80" w:after="40"/>
+      <w:ind w:left="900" w:hanging="900"/>
       <w:jc w:val="left"/>
       <w:outlineLvl w:val="3"/>
     </w:pPr>
@@ -9083,6 +9700,7 @@
   <w:style w:type="character" w:default="1" w:styleId="DefaultParagraphFont">
     <w:name w:val="Default Paragraph Font"/>
     <w:uiPriority w:val="1"/>
+    <w:semiHidden/>
     <w:unhideWhenUsed/>
   </w:style>
   <w:style w:type="table" w:default="1" w:styleId="TableNormal">
@@ -9156,7 +9774,7 @@
     <w:basedOn w:val="DefaultParagraphFont"/>
     <w:link w:val="Heading4"/>
     <w:uiPriority w:val="9"/>
-    <w:rsid w:val="0007667E"/>
+    <w:rsid w:val="00C76F8A"/>
     <w:rPr>
       <w:rFonts w:ascii="Times New Roman" w:eastAsiaTheme="majorEastAsia" w:hAnsi="Times New Roman" w:cstheme="majorBidi"/>
       <w:b/>

</xml_diff>